<commit_message>
Engine 1.4.0: inline markdown subset in author text
prose() now takes **bold**, *italic* (nested either way, or inside link
text) and \* for a literal asterisk, alongside the existing links. Escape
first; links held aside while emphasis is matched; markers must hug their
text; no block markup.

- tests/markdown-cases.cjs: 39 cases, run against the real prose(), meant
  to be copied to BSP Forms / intl.js when they adopt the subset
- suite: the cases plus markdown rendering from all three configs
- docs/03-config.md "Formatting"; the SME wording document marks the rows
  that take formatting (regenerated)
- dev live check: the deployed prose() renders the subset

Suite 226/226; dev admin live run 33/33.

Co-Authored-By: Claude Opus 5.5 <noreply@anthropic.com>
</commit_message>
<xml_diff>
--- a/docs/PS-Work-Zone-Confirmation-wording.docx
+++ b/docs/PS-Work-Zone-Confirmation-wording.docx
@@ -15,7 +15,7 @@
         <w:rPr>
           <w:color w:val="6B7280"/>
         </w:rPr>
-        <w:t xml:space="preserve">Engine 1.3.4 · prepared 2026-10-15 · </w:t>
+        <w:t xml:space="preserve">Engine 1.4.0 · prepared 2026-10-15 · </w:t>
       </w:r>
       <w:r>
         <w:rPr>
@@ -62,6 +62,14 @@
       </w:pPr>
       <w:r>
         <w:t>Keep links in the form [link text](address). You can change the link text in the square brackets; leave the address in round brackets alone unless that row is about it.</w:t>
+      </w:r>
+    </w:p>
+    <w:p>
+      <w:pPr>
+        <w:pStyle w:val="ListBullet"/>
+      </w:pPr>
+      <w:r>
+        <w:t>Rows marked "Formatting allowed" can also use **bold** and *italic* (two asterisks or one, right up against the words). Nothing else works: no headings, bullet points, numbered lists or lines. Those show exactly as typed. In every other row, asterisks and brackets show as typed.</w:t>
       </w:r>
     </w:p>
     <w:p>
@@ -416,6 +424,20 @@
             </w:pPr>
             <w:r>
               <w:rPr>
+                <w:b/>
+                <w:i w:val="0"/>
+                <w:color w:val="0F6E3F"/>
+                <w:sz w:val="15"/>
+              </w:rPr>
+              <w:t>Formatting allowed</w:t>
+            </w:r>
+          </w:p>
+          <w:p>
+            <w:pPr>
+              <w:spacing w:after="0"/>
+            </w:pPr>
+            <w:r>
+              <w:rPr>
                 <w:b w:val="0"/>
                 <w:i/>
                 <w:color w:val="6B7280"/>
@@ -521,6 +543,20 @@
             </w:pPr>
             <w:r>
               <w:rPr>
+                <w:b/>
+                <w:i w:val="0"/>
+                <w:color w:val="0F6E3F"/>
+                <w:sz w:val="15"/>
+              </w:rPr>
+              <w:t>Formatting allowed</w:t>
+            </w:r>
+          </w:p>
+          <w:p>
+            <w:pPr>
+              <w:spacing w:after="0"/>
+            </w:pPr>
+            <w:r>
+              <w:rPr>
                 <w:b w:val="0"/>
                 <w:i/>
                 <w:color w:val="6B7280"/>
@@ -855,6 +891,20 @@
             </w:pPr>
             <w:r>
               <w:rPr>
+                <w:b/>
+                <w:i w:val="0"/>
+                <w:color w:val="0F6E3F"/>
+                <w:sz w:val="15"/>
+              </w:rPr>
+              <w:t>Formatting allowed</w:t>
+            </w:r>
+          </w:p>
+          <w:p>
+            <w:pPr>
+              <w:spacing w:after="0"/>
+            </w:pPr>
+            <w:r>
+              <w:rPr>
                 <w:b w:val="0"/>
                 <w:i/>
                 <w:color w:val="6B7280"/>
@@ -2862,6 +2912,20 @@
             </w:pPr>
             <w:r>
               <w:rPr>
+                <w:b/>
+                <w:i w:val="0"/>
+                <w:color w:val="0F6E3F"/>
+                <w:sz w:val="15"/>
+              </w:rPr>
+              <w:t>Formatting allowed</w:t>
+            </w:r>
+          </w:p>
+          <w:p>
+            <w:pPr>
+              <w:spacing w:after="0"/>
+            </w:pPr>
+            <w:r>
+              <w:rPr>
                 <w:b w:val="0"/>
                 <w:i/>
                 <w:color w:val="6B7280"/>
@@ -3070,6 +3134,20 @@
             </w:pPr>
             <w:r>
               <w:rPr>
+                <w:b/>
+                <w:i w:val="0"/>
+                <w:color w:val="0F6E3F"/>
+                <w:sz w:val="15"/>
+              </w:rPr>
+              <w:t>Formatting allowed</w:t>
+            </w:r>
+          </w:p>
+          <w:p>
+            <w:pPr>
+              <w:spacing w:after="0"/>
+            </w:pPr>
+            <w:r>
+              <w:rPr>
                 <w:b w:val="0"/>
                 <w:i/>
                 <w:color w:val="6B7280"/>
@@ -3278,6 +3356,20 @@
             </w:pPr>
             <w:r>
               <w:rPr>
+                <w:b/>
+                <w:i w:val="0"/>
+                <w:color w:val="0F6E3F"/>
+                <w:sz w:val="15"/>
+              </w:rPr>
+              <w:t>Formatting allowed</w:t>
+            </w:r>
+          </w:p>
+          <w:p>
+            <w:pPr>
+              <w:spacing w:after="0"/>
+            </w:pPr>
+            <w:r>
+              <w:rPr>
                 <w:b w:val="0"/>
                 <w:i/>
                 <w:color w:val="6B7280"/>
@@ -3486,6 +3578,20 @@
             </w:pPr>
             <w:r>
               <w:rPr>
+                <w:b/>
+                <w:i w:val="0"/>
+                <w:color w:val="0F6E3F"/>
+                <w:sz w:val="15"/>
+              </w:rPr>
+              <w:t>Formatting allowed</w:t>
+            </w:r>
+          </w:p>
+          <w:p>
+            <w:pPr>
+              <w:spacing w:after="0"/>
+            </w:pPr>
+            <w:r>
+              <w:rPr>
                 <w:b w:val="0"/>
                 <w:i/>
                 <w:color w:val="6B7280"/>
@@ -3694,6 +3800,20 @@
             </w:pPr>
             <w:r>
               <w:rPr>
+                <w:b/>
+                <w:i w:val="0"/>
+                <w:color w:val="0F6E3F"/>
+                <w:sz w:val="15"/>
+              </w:rPr>
+              <w:t>Formatting allowed</w:t>
+            </w:r>
+          </w:p>
+          <w:p>
+            <w:pPr>
+              <w:spacing w:after="0"/>
+            </w:pPr>
+            <w:r>
+              <w:rPr>
                 <w:b w:val="0"/>
                 <w:i/>
                 <w:color w:val="6B7280"/>
@@ -3824,6 +3944,20 @@
             </w:pPr>
             <w:r>
               <w:rPr>
+                <w:b/>
+                <w:i w:val="0"/>
+                <w:color w:val="0F6E3F"/>
+                <w:sz w:val="15"/>
+              </w:rPr>
+              <w:t>Formatting allowed</w:t>
+            </w:r>
+          </w:p>
+          <w:p>
+            <w:pPr>
+              <w:spacing w:after="0"/>
+            </w:pPr>
+            <w:r>
+              <w:rPr>
                 <w:b w:val="0"/>
                 <w:i/>
                 <w:color w:val="6B7280"/>
@@ -3927,6 +4061,20 @@
             </w:pPr>
             <w:r>
               <w:rPr>
+                <w:b/>
+                <w:i w:val="0"/>
+                <w:color w:val="0F6E3F"/>
+                <w:sz w:val="15"/>
+              </w:rPr>
+              <w:t>Formatting allowed</w:t>
+            </w:r>
+          </w:p>
+          <w:p>
+            <w:pPr>
+              <w:spacing w:after="0"/>
+            </w:pPr>
+            <w:r>
+              <w:rPr>
                 <w:b w:val="0"/>
                 <w:i/>
                 <w:color w:val="6B7280"/>
@@ -4160,6 +4308,20 @@
             </w:pPr>
             <w:r>
               <w:rPr>
+                <w:b/>
+                <w:i w:val="0"/>
+                <w:color w:val="0F6E3F"/>
+                <w:sz w:val="15"/>
+              </w:rPr>
+              <w:t>Formatting allowed</w:t>
+            </w:r>
+          </w:p>
+          <w:p>
+            <w:pPr>
+              <w:spacing w:after="0"/>
+            </w:pPr>
+            <w:r>
+              <w:rPr>
                 <w:b w:val="0"/>
                 <w:i/>
                 <w:color w:val="6B7280"/>
@@ -5112,6 +5274,20 @@
             </w:pPr>
             <w:r>
               <w:rPr>
+                <w:b/>
+                <w:i w:val="0"/>
+                <w:color w:val="0F6E3F"/>
+                <w:sz w:val="15"/>
+              </w:rPr>
+              <w:t>Formatting allowed</w:t>
+            </w:r>
+          </w:p>
+          <w:p>
+            <w:pPr>
+              <w:spacing w:after="0"/>
+            </w:pPr>
+            <w:r>
+              <w:rPr>
                 <w:b w:val="0"/>
                 <w:i/>
                 <w:color w:val="6B7280"/>
@@ -5318,6 +5494,20 @@
             </w:pPr>
             <w:r>
               <w:rPr>
+                <w:b/>
+                <w:i w:val="0"/>
+                <w:color w:val="0F6E3F"/>
+                <w:sz w:val="15"/>
+              </w:rPr>
+              <w:t>Formatting allowed</w:t>
+            </w:r>
+          </w:p>
+          <w:p>
+            <w:pPr>
+              <w:spacing w:after="0"/>
+            </w:pPr>
+            <w:r>
+              <w:rPr>
                 <w:b w:val="0"/>
                 <w:i/>
                 <w:color w:val="6B7280"/>
@@ -5516,6 +5706,20 @@
                 <w:sz w:val="18"/>
               </w:rPr>
               <w:t>"Already submitted" screen: message</w:t>
+            </w:r>
+          </w:p>
+          <w:p>
+            <w:pPr>
+              <w:spacing w:after="0"/>
+            </w:pPr>
+            <w:r>
+              <w:rPr>
+                <w:b/>
+                <w:i w:val="0"/>
+                <w:color w:val="0F6E3F"/>
+                <w:sz w:val="15"/>
+              </w:rPr>
+              <w:t>Formatting allowed</w:t>
             </w:r>
           </w:p>
           <w:p>
@@ -6118,6 +6322,20 @@
             </w:pPr>
             <w:r>
               <w:rPr>
+                <w:b/>
+                <w:i w:val="0"/>
+                <w:color w:val="0F6E3F"/>
+                <w:sz w:val="15"/>
+              </w:rPr>
+              <w:t>Formatting allowed</w:t>
+            </w:r>
+          </w:p>
+          <w:p>
+            <w:pPr>
+              <w:spacing w:after="0"/>
+            </w:pPr>
+            <w:r>
+              <w:rPr>
                 <w:b w:val="0"/>
                 <w:i/>
                 <w:color w:val="6B7280"/>
@@ -6316,6 +6534,20 @@
                 <w:sz w:val="18"/>
               </w:rPr>
               <w:t>"No areas assigned" screen: message</w:t>
+            </w:r>
+          </w:p>
+          <w:p>
+            <w:pPr>
+              <w:spacing w:after="0"/>
+            </w:pPr>
+            <w:r>
+              <w:rPr>
+                <w:b/>
+                <w:i w:val="0"/>
+                <w:color w:val="0F6E3F"/>
+                <w:sz w:val="15"/>
+              </w:rPr>
+              <w:t>Formatting allowed</w:t>
             </w:r>
           </w:p>
           <w:p>
@@ -6996,6 +7228,20 @@
             </w:pPr>
             <w:r>
               <w:rPr>
+                <w:b/>
+                <w:i w:val="0"/>
+                <w:color w:val="0F6E3F"/>
+                <w:sz w:val="15"/>
+              </w:rPr>
+              <w:t>Formatting allowed</w:t>
+            </w:r>
+          </w:p>
+          <w:p>
+            <w:pPr>
+              <w:spacing w:after="0"/>
+            </w:pPr>
+            <w:r>
+              <w:rPr>
                 <w:b w:val="0"/>
                 <w:i/>
                 <w:color w:val="6B7280"/>
@@ -7204,6 +7450,20 @@
             </w:pPr>
             <w:r>
               <w:rPr>
+                <w:b/>
+                <w:i w:val="0"/>
+                <w:color w:val="0F6E3F"/>
+                <w:sz w:val="15"/>
+              </w:rPr>
+              <w:t>Formatting allowed</w:t>
+            </w:r>
+          </w:p>
+          <w:p>
+            <w:pPr>
+              <w:spacing w:after="0"/>
+            </w:pPr>
+            <w:r>
+              <w:rPr>
                 <w:b w:val="0"/>
                 <w:i/>
                 <w:color w:val="6B7280"/>
@@ -7414,6 +7674,20 @@
             </w:pPr>
             <w:r>
               <w:rPr>
+                <w:b/>
+                <w:i w:val="0"/>
+                <w:color w:val="0F6E3F"/>
+                <w:sz w:val="15"/>
+              </w:rPr>
+              <w:t>Formatting allowed</w:t>
+            </w:r>
+          </w:p>
+          <w:p>
+            <w:pPr>
+              <w:spacing w:after="0"/>
+            </w:pPr>
+            <w:r>
+              <w:rPr>
                 <w:b w:val="0"/>
                 <w:i/>
                 <w:color w:val="6B7280"/>
@@ -7727,6 +8001,20 @@
             </w:pPr>
             <w:r>
               <w:rPr>
+                <w:b/>
+                <w:i w:val="0"/>
+                <w:color w:val="0F6E3F"/>
+                <w:sz w:val="15"/>
+              </w:rPr>
+              <w:t>Formatting allowed</w:t>
+            </w:r>
+          </w:p>
+          <w:p>
+            <w:pPr>
+              <w:spacing w:after="0"/>
+            </w:pPr>
+            <w:r>
+              <w:rPr>
                 <w:b w:val="0"/>
                 <w:i/>
                 <w:color w:val="6B7280"/>
@@ -7929,6 +8217,20 @@
                 <w:sz w:val="18"/>
               </w:rPr>
               <w:t>Side panel, "Information" › information paragraph 2: text</w:t>
+            </w:r>
+          </w:p>
+          <w:p>
+            <w:pPr>
+              <w:spacing w:after="0"/>
+            </w:pPr>
+            <w:r>
+              <w:rPr>
+                <w:b/>
+                <w:i w:val="0"/>
+                <w:color w:val="0F6E3F"/>
+                <w:sz w:val="15"/>
+              </w:rPr>
+              <w:t>Formatting allowed</w:t>
             </w:r>
           </w:p>
           <w:p>

</xml_diff>